<commit_message>
Add automation-flow chart refinements and update Word documents
</commit_message>
<xml_diff>
--- a/econsim/2026-02-20 Policy choices for the AI transition.docx
+++ b/econsim/2026-02-20 Policy choices for the AI transition.docx
@@ -79,201 +79,308 @@
       <w:r>
         <w:t>taxes, transfers, social ownership rules, and automatic stabilizers</w:t>
       </w:r>
+      <w:r>
+        <w:t>)</w:t>
+      </w:r>
+      <w:r>
+        <w:t xml:space="preserve"> </w:t>
+      </w:r>
+      <w:r>
+        <w:t xml:space="preserve">and </w:t>
+      </w:r>
+      <w:r>
+        <w:t>describes</w:t>
+      </w:r>
+      <w:r>
+        <w:t xml:space="preserve"> each mechanism in plain terms so non-modelers can understand what institutional choices are being assumed.</w:t>
+      </w:r>
+    </w:p>
+    <w:p>
+      <w:r>
+        <w:t>The core policy package includes:</w:t>
+      </w:r>
+    </w:p>
+    <w:p>
+      <w:pPr>
+        <w:pStyle w:val="ListBullet"/>
+      </w:pPr>
+      <w:r>
+        <w:t xml:space="preserve">a Social Wealth Trust (FUND) that accumulates </w:t>
+      </w:r>
+      <w:r>
+        <w:t xml:space="preserve">equity </w:t>
+      </w:r>
+      <w:r>
+        <w:t>ownership over time (with an explicit cap</w:t>
+      </w:r>
       <w:proofErr w:type="gramStart"/>
       <w:r>
-        <w:t>),</w:t>
+        <w:t>);</w:t>
+      </w:r>
+      <w:proofErr w:type="gramEnd"/>
+    </w:p>
+    <w:p>
+      <w:pPr>
+        <w:pStyle w:val="ListBullet"/>
+      </w:pPr>
+      <w:r>
+        <w:t>a Universal Basic Income (UBI) computed to maintain a baseline real-income pool and constrained by a ratchet (non-decreasing</w:t>
+      </w:r>
+      <w:proofErr w:type="gramStart"/>
+      <w:r>
+        <w:t>);</w:t>
+      </w:r>
+      <w:proofErr w:type="gramEnd"/>
+    </w:p>
+    <w:p>
+      <w:pPr>
+        <w:pStyle w:val="ListBullet"/>
+      </w:pPr>
+      <w:r>
+        <w:t>a value-added tax (VAT) paired with a targeted low-income VAT credit (prebate</w:t>
+      </w:r>
+      <w:proofErr w:type="gramStart"/>
+      <w:r>
+        <w:t>);</w:t>
+      </w:r>
+      <w:proofErr w:type="gramEnd"/>
+    </w:p>
+    <w:p>
+      <w:pPr>
+        <w:pStyle w:val="ListBullet"/>
+      </w:pPr>
+      <w:r>
+        <w:t>a marginal income tax above a percentile-defined cutoff (with UBI excluded from the income-tax base); and</w:t>
+      </w:r>
+    </w:p>
+    <w:p>
+      <w:pPr>
+        <w:pStyle w:val="ListBullet"/>
+      </w:pPr>
+      <w:r>
+        <w:t>a corporate income tax that can automatically rise as wages fall during the automation transition.</w:t>
+      </w:r>
+    </w:p>
+    <w:p>
+      <w:pPr>
+        <w:pStyle w:val="ListBullet"/>
+      </w:pPr>
+      <w:r>
+        <w:t>policies to adapt existing fixed-nominal debt, specifically mortgages, to a deflationary environment.</w:t>
+      </w:r>
+    </w:p>
+    <w:p>
+      <w:pPr>
+        <w:pStyle w:val="Heading1"/>
+      </w:pPr>
+      <w:r>
+        <w:t>Introduction</w:t>
+      </w:r>
+    </w:p>
+    <w:p>
+      <w:r>
+        <w:t xml:space="preserve">The sudden, rapid diffusion of advanced artificial intelligence through the economy </w:t>
+      </w:r>
+      <w:r>
+        <w:t>will create</w:t>
+      </w:r>
+      <w:r>
+        <w:t xml:space="preserve"> crises and opportunities unlike any prior event in human history. Huge efforts are expended on concerns such as "alignment" and "safety," which </w:t>
+      </w:r>
+      <w:r>
+        <w:t xml:space="preserve">are things that </w:t>
+      </w:r>
+      <w:r>
+        <w:t>matter. But the most urgent questions</w:t>
+      </w:r>
+      <w:r>
+        <w:t xml:space="preserve">, which </w:t>
+      </w:r>
+      <w:r>
+        <w:t>will shape real lives at scale</w:t>
+      </w:r>
+      <w:r>
+        <w:t xml:space="preserve">, </w:t>
+      </w:r>
+      <w:r>
+        <w:t xml:space="preserve">are economic: what happens to incomes, purchasing power, investment, and social stability when automation spreads through most forms of work? Despite its urgency, this subject </w:t>
+      </w:r>
+      <w:r>
+        <w:t xml:space="preserve">is only beginning to receive the </w:t>
+      </w:r>
+      <w:r>
+        <w:t>attention</w:t>
+      </w:r>
+      <w:r>
+        <w:t xml:space="preserve"> it deserves.</w:t>
+      </w:r>
+    </w:p>
+    <w:p>
+      <w:r>
+        <w:t>Historically, the revenues earned from economic activity are split among labor, capital, and government. In plain terms: consumers buy goods and services; businesses use that revenue to pay workers, pay taxes, and generate profits; workers then spend and save; owners invest and consume out of profits; and the cycle continues. This is capitalism</w:t>
+      </w:r>
+      <w:r>
+        <w:t xml:space="preserve">: </w:t>
+      </w:r>
+      <w:r>
+        <w:t>a circular feedback system</w:t>
+      </w:r>
+      <w:r>
+        <w:t xml:space="preserve"> that</w:t>
       </w:r>
       <w:r>
         <w:t xml:space="preserve"> </w:t>
       </w:r>
       <w:r>
-        <w:t>and</w:t>
+        <w:t>stay</w:t>
+      </w:r>
+      <w:r>
+        <w:t>s</w:t>
+      </w:r>
+      <w:r>
+        <w:t xml:space="preserve"> in</w:t>
+      </w:r>
+      <w:r>
+        <w:t xml:space="preserve"> balance because the ability to produce is meaningless without the ability to buy. </w:t>
+      </w:r>
+      <w:r>
+        <w:t>W</w:t>
+      </w:r>
+      <w:r>
+        <w:t xml:space="preserve">ages are </w:t>
+      </w:r>
+      <w:r>
+        <w:t xml:space="preserve">not </w:t>
+      </w:r>
+      <w:r>
+        <w:t>the only source of purchasing power - people can also consume out of dividends, transfers, credit, and asset income - but the system must reliably generate broad, spendable income at the scale required to clear the economy’s output.</w:t>
+      </w:r>
+    </w:p>
+    <w:p>
+      <w:r>
+        <w:lastRenderedPageBreak/>
+        <w:t>T</w:t>
+      </w:r>
+      <w:r>
+        <w:t xml:space="preserve">he </w:t>
+      </w:r>
+      <w:r>
+        <w:t>consequences</w:t>
+      </w:r>
+      <w:r>
+        <w:t xml:space="preserve"> can be severe and persistent</w:t>
+      </w:r>
+      <w:r>
+        <w:t xml:space="preserve"> when that loop fails</w:t>
+      </w:r>
+      <w:r>
+        <w:t xml:space="preserve">. Collapsing demand propagates into collapsing production: falling sales lead to layoffs and cutbacks; layoffs reduce incomes; reduced incomes further reduce sales; investment stops; and productive capacity can be impaired for years. The Great Depression </w:t>
+      </w:r>
+      <w:r>
+        <w:t>was</w:t>
+      </w:r>
+      <w:r>
+        <w:t xml:space="preserve"> a feedback failure so </w:t>
+      </w:r>
+      <w:r>
+        <w:t>profound</w:t>
+      </w:r>
+      <w:r>
+        <w:t xml:space="preserve"> that even extraordinary policy efforts struggled to restore </w:t>
+      </w:r>
+      <w:r>
+        <w:t xml:space="preserve">normal economic </w:t>
+      </w:r>
+      <w:r>
+        <w:t>activity. My grandfather, a railroad fireman, was out of work for a decade. He traded a solid gold railroad watch for a milk cow to plow the garden and feed the family. Whatever one emphasizes as proximate causes, the durable lesson is that restart can be difficult once the link between output and purchasing power is damaged</w:t>
+      </w:r>
+      <w:r>
+        <w:t xml:space="preserve">, </w:t>
+      </w:r>
+      <w:r>
+        <w:t xml:space="preserve">and the consequences can spill into </w:t>
+      </w:r>
+      <w:r>
+        <w:t xml:space="preserve">conflict and </w:t>
+      </w:r>
+      <w:r>
+        <w:t>politics for generations.</w:t>
+      </w:r>
+    </w:p>
+    <w:p>
+      <w:r>
+        <w:t>Economically, advanced artificial intelligence is an unusually powerful form of automation. It will automate information and intellectual work first</w:t>
+      </w:r>
+      <w:r>
+        <w:t>. A</w:t>
+      </w:r>
+      <w:r>
+        <w:t>s that proceeds</w:t>
+      </w:r>
+      <w:r>
+        <w:t>,</w:t>
+      </w:r>
+      <w:r>
+        <w:t xml:space="preserve"> it will </w:t>
+      </w:r>
+      <w:r>
+        <w:t xml:space="preserve">somewhat later </w:t>
+      </w:r>
+      <w:r>
+        <w:t xml:space="preserve">also </w:t>
+      </w:r>
+      <w:r>
+        <w:t>accelerate automation in physical systems</w:t>
+      </w:r>
+      <w:r>
+        <w:t xml:space="preserve">, </w:t>
+      </w:r>
+      <w:r>
+        <w:t>mining, manufacturing, logistics, agriculture, construction, and beyond. Automation raises productivity and lowers operating costs. But it also changes the income architecture of the economy: as software and machines substitute for labor, a smaller fraction of value added shows up as wages and a larger fraction shows up as profits and returns to capital. If ownership of that capital is concentrated, then purchasing power becomes concentrated too</w:t>
+      </w:r>
+      <w:r>
+        <w:t xml:space="preserve">, </w:t>
+      </w:r>
+      <w:r>
+        <w:t>even while productive capacity expands.</w:t>
+      </w:r>
+    </w:p>
+    <w:p>
+      <w:r>
+        <w:t xml:space="preserve">Corporations </w:t>
+      </w:r>
+      <w:r>
+        <w:t>are</w:t>
+      </w:r>
+      <w:r>
+        <w:t xml:space="preserve"> the engines of modern wealth creation. Only large-scale enterprises can reliably perform research and development, design, logistics, manufacturing, marketing, distribution, and global support for complex products and services. </w:t>
+      </w:r>
+      <w:proofErr w:type="gramStart"/>
+      <w:r>
+        <w:t>So</w:t>
       </w:r>
       <w:proofErr w:type="gramEnd"/>
       <w:r>
-        <w:t xml:space="preserve"> </w:t>
-      </w:r>
-      <w:r>
-        <w:t>describes</w:t>
-      </w:r>
-      <w:r>
-        <w:t xml:space="preserve"> each mechanism in plain terms so non-modelers can understand what institutional choices are being assumed.</w:t>
-      </w:r>
-    </w:p>
-    <w:p>
-      <w:r>
-        <w:t>The core policy package includes:</w:t>
-      </w:r>
-    </w:p>
-    <w:p>
-      <w:pPr>
-        <w:pStyle w:val="ListBullet"/>
-      </w:pPr>
-      <w:r>
-        <w:t xml:space="preserve">a Social Wealth Trust (FUND) that accumulates </w:t>
-      </w:r>
-      <w:r>
-        <w:t xml:space="preserve">equity </w:t>
-      </w:r>
-      <w:r>
-        <w:t>ownership over time (with an explicit cap</w:t>
-      </w:r>
-      <w:proofErr w:type="gramStart"/>
-      <w:r>
-        <w:t>);</w:t>
-      </w:r>
-      <w:proofErr w:type="gramEnd"/>
-    </w:p>
-    <w:p>
-      <w:pPr>
-        <w:pStyle w:val="ListBullet"/>
-      </w:pPr>
-      <w:r>
-        <w:t>a Universal Basic Income (UBI) computed to maintain a baseline real-income pool and constrained by a ratchet (non-decreasing</w:t>
-      </w:r>
-      <w:proofErr w:type="gramStart"/>
-      <w:r>
-        <w:t>);</w:t>
-      </w:r>
-      <w:proofErr w:type="gramEnd"/>
-    </w:p>
-    <w:p>
-      <w:pPr>
-        <w:pStyle w:val="ListBullet"/>
-      </w:pPr>
-      <w:r>
-        <w:t>a value-added tax (VAT) paired with a targeted low-income VAT credit (prebate</w:t>
-      </w:r>
-      <w:proofErr w:type="gramStart"/>
-      <w:r>
-        <w:t>);</w:t>
-      </w:r>
-      <w:proofErr w:type="gramEnd"/>
-    </w:p>
-    <w:p>
-      <w:pPr>
-        <w:pStyle w:val="ListBullet"/>
-      </w:pPr>
-      <w:r>
-        <w:t>a marginal income tax above a percentile-defined cutoff (with UBI excluded from the income-tax base); and</w:t>
-      </w:r>
-    </w:p>
-    <w:p>
-      <w:pPr>
-        <w:pStyle w:val="ListBullet"/>
-      </w:pPr>
-      <w:r>
-        <w:t>a corporate income tax that can automatically rise as wages fall during the automation transition.</w:t>
-      </w:r>
-    </w:p>
-    <w:p>
-      <w:pPr>
-        <w:pStyle w:val="Heading1"/>
-      </w:pPr>
-      <w:r>
-        <w:t>Introduction</w:t>
-      </w:r>
-    </w:p>
-    <w:p>
-      <w:r>
-        <w:t xml:space="preserve">The sudden, rapid diffusion of advanced artificial intelligence through the economy </w:t>
-      </w:r>
-      <w:r>
-        <w:t>is</w:t>
-      </w:r>
-      <w:r>
-        <w:t xml:space="preserve"> creat</w:t>
-      </w:r>
-      <w:r>
-        <w:t>ing</w:t>
-      </w:r>
-      <w:r>
-        <w:t xml:space="preserve"> changes, challenges, crises, and opportunities unlike any prior event in human history. Huge efforts are expended on concerns such as "alignment" and "safety," which </w:t>
-      </w:r>
-      <w:r>
-        <w:t xml:space="preserve">are things that </w:t>
-      </w:r>
-      <w:r>
-        <w:t>matter. But the most urgent questions - the ones that will shape real lives at scale - are economic: what happens to incomes, purchasing power, investment, and social stability when automation spreads through most forms of work? Despite its urgency, this subject has received far too little serious attention.</w:t>
-      </w:r>
-    </w:p>
-    <w:p>
-      <w:r>
-        <w:t>Historically, the revenues earned from economic activity are split among labor, capital, and government. In plain terms: consumers buy goods and services; businesses use that revenue to pay workers, pay taxes, and generate profits; workers then spend and save; owners invest and consume out of profits; and the cycle continues. This is how capitalism works</w:t>
-      </w:r>
-      <w:r>
-        <w:t xml:space="preserve">: </w:t>
-      </w:r>
-      <w:r>
-        <w:t>it</w:t>
-      </w:r>
-      <w:r>
-        <w:t xml:space="preserve">’s </w:t>
-      </w:r>
-      <w:r>
-        <w:t>a circular feedback system</w:t>
-      </w:r>
-      <w:r>
-        <w:t xml:space="preserve"> that</w:t>
-      </w:r>
-      <w:r>
-        <w:t xml:space="preserve"> </w:t>
-      </w:r>
-      <w:r>
-        <w:t>stay in</w:t>
-      </w:r>
-      <w:r>
-        <w:t xml:space="preserve"> balance because the ability to produce is meaningless without the ability to buy. The issue is not that wages are the only source of purchasing power - people can also consume out of dividends, transfers, credit, and asset income - but that the system must reliably generate broad, spendable income at the scale required to clear the economy’s output.</w:t>
-      </w:r>
-    </w:p>
-    <w:p>
-      <w:r>
-        <w:lastRenderedPageBreak/>
-        <w:t>When that loop breaks, the results can be severe and persistent. Collapsing demand propagates into collapsing production: falling sales lead to layoffs and cutbacks; layoffs reduce incomes; reduced incomes further reduce sales; investment stops; and productive capacity can be impaired for years. The Great Depression is the canonical example of a feedback failure so deep that even extraordinary policy efforts struggled to restore activity quickly. My grandfather, a railroad fireman, was out of work for a decade. He traded a solid gold railroad watch for a milk cow to plow the garden and feed the family. Whatever one emphasizes as proximate causes, the durable lesson is that restart can be difficult once the link between output and purchasing power is damaged - and the consequences can spill into politics and conflict for generations.</w:t>
-      </w:r>
-    </w:p>
-    <w:p>
-      <w:r>
-        <w:t xml:space="preserve">Economically, advanced artificial intelligence is an unusually powerful form of automation. It will automate information and intellectual work first, and as that proceeds it will </w:t>
-      </w:r>
-      <w:r>
-        <w:t xml:space="preserve">also </w:t>
-      </w:r>
-      <w:r>
-        <w:t>accelerate automation in physical systems</w:t>
+        <w:t xml:space="preserve"> the issue is not to stop progress, </w:t>
+      </w:r>
+      <w:r>
+        <w:t>nor</w:t>
+      </w:r>
+      <w:r>
+        <w:t xml:space="preserve"> to replace productive enterprise with circular services in which we merely transact among ourselves. The issue is how the feedback loop that connects production to purchasing power can remain stable as labor income shrinks</w:t>
+      </w:r>
+      <w:r>
+        <w:t>, so that wealth creation can continue.</w:t>
+      </w:r>
+    </w:p>
+    <w:p>
+      <w:r>
+        <w:t>That brings us to the core conundrum. If wages stop being the dominant channel by which most households receive income, where does broad purchasing power come from? If we want a prosperous society that continues to invent, build, and improve while much of the operational work is automated</w:t>
       </w:r>
       <w:r>
         <w:t xml:space="preserve">, </w:t>
       </w:r>
       <w:r>
-        <w:t>mining, manufacturing, logistics, agriculture, construction, and beyond. Automation raises productivity and lowers operating costs. But it also changes the income architecture of the economy: as software and machines substitute for labor, a smaller fraction of value added shows up as wages and a larger fraction shows up as profits and returns to capital. If ownership of that capital is concentrated, then purchasing power becomes concentrated too</w:t>
-      </w:r>
-      <w:r>
-        <w:t xml:space="preserve">, </w:t>
-      </w:r>
-      <w:r>
-        <w:t>even while productive capacity expands.</w:t>
-      </w:r>
-    </w:p>
-    <w:p>
-      <w:r>
-        <w:t xml:space="preserve">Corporations </w:t>
-      </w:r>
-      <w:r>
-        <w:t>are</w:t>
-      </w:r>
-      <w:r>
-        <w:t xml:space="preserve"> the engines of modern wealth creation. Only large-scale enterprises can reliably perform research and development, design, logistics, manufacturing, marketing, distribution, and global support for complex products and services. So the issue is not to stop progress, and it is not to replace productive enterprise with circular services in which we merely transact among ourselves. The issue is how the feedback loop that connects production to purchasing power can remain stable as labor income shrinks.</w:t>
-      </w:r>
-    </w:p>
-    <w:p>
-      <w:r>
-        <w:t>That brings us to the core conundrum. If wages stop being the dominant channel by which most households receive income, where does broad purchasing power come from? If we want a prosperous society that continues to invent, build, and improve while much of the operational work is automated</w:t>
-      </w:r>
-      <w:r>
-        <w:t xml:space="preserve">, </w:t>
-      </w:r>
-      <w:r>
         <w:t>then we will have to redesign parts of the income-and-ownership system, not just "patch" it.</w:t>
       </w:r>
     </w:p>
@@ -301,7 +408,13 @@
     </w:p>
     <w:p>
       <w:r>
-        <w:t xml:space="preserve">There are plausible ways forward. They likely involve some combination of broadened ownership, redesigned tax bases suited to an economy where labor income is no longer central, and income mechanisms that are not tightly coupled to employment. But proposals should be judged by concrete </w:t>
+        <w:t xml:space="preserve">There are plausible ways forward. They likely involve some combination of broadened ownership, redesigned tax bases suited to an economy where labor income is no longer central, and income mechanisms that are </w:t>
+      </w:r>
+      <w:r>
+        <w:t>less</w:t>
+      </w:r>
+      <w:r>
+        <w:t xml:space="preserve"> tightly coupled to employment. But proposals should be judged by concrete </w:t>
       </w:r>
       <w:r>
         <w:lastRenderedPageBreak/>
@@ -315,7 +428,75 @@
     </w:p>
     <w:p>
       <w:r>
-        <w:t>So what follows is an explicit economic transition model: a stock-flow representation of households, firms, banks, and government, with automation modeled as a rising substitution of capital and software for labor - shifting value added from wages toward profits. The central question the model is built to answer is simple to state and hard to solve: what ownership and policy architectures keep aggregate demand, investment incentives, and social stability inside a viable region as automation advances?</w:t>
+        <w:t xml:space="preserve">So what follows is an explicit economic transition model: a stock-flow representation of </w:t>
+      </w:r>
+      <w:r>
+        <w:t>20,000 “</w:t>
+      </w:r>
+      <w:r>
+        <w:t>households</w:t>
+      </w:r>
+      <w:r>
+        <w:t>” whose wealth, income, revolving debt and mortgages roughly correspond to the distributions of families in the United States</w:t>
+      </w:r>
+      <w:r>
+        <w:t>. It includes</w:t>
+      </w:r>
+      <w:r>
+        <w:t xml:space="preserve"> </w:t>
+      </w:r>
+      <w:r>
+        <w:t>firms, banks, and government</w:t>
+      </w:r>
+      <w:r>
+        <w:t xml:space="preserve"> as aggregate players</w:t>
+      </w:r>
+      <w:r>
+        <w:t xml:space="preserve">. In this model economy, </w:t>
+      </w:r>
+      <w:r>
+        <w:t xml:space="preserve">automation </w:t>
+      </w:r>
+      <w:r>
+        <w:t>causes over time</w:t>
+      </w:r>
+      <w:r>
+        <w:t xml:space="preserve"> a rising substitution of capital and software for labor</w:t>
+      </w:r>
+      <w:r>
+        <w:t>, s</w:t>
+      </w:r>
+      <w:r>
+        <w:t>hifting value</w:t>
+      </w:r>
+      <w:r>
+        <w:t>-</w:t>
+      </w:r>
+      <w:r>
+        <w:t>added from wages toward profits</w:t>
+      </w:r>
+      <w:r>
+        <w:t xml:space="preserve"> over time</w:t>
+      </w:r>
+      <w:r>
+        <w:t xml:space="preserve">. </w:t>
+      </w:r>
+    </w:p>
+    <w:p>
+      <w:r>
+        <w:t>The central question the model is built to answer is simple to state</w:t>
+      </w:r>
+      <w:r>
+        <w:t>,</w:t>
+      </w:r>
+      <w:r>
+        <w:t xml:space="preserve"> </w:t>
+      </w:r>
+      <w:r>
+        <w:t>but</w:t>
+      </w:r>
+      <w:r>
+        <w:t xml:space="preserve"> hard to solve: what ownership and policy architectures keep aggregate demand, investment incentives, and social stability inside a viable region as automation advances?</w:t>
       </w:r>
     </w:p>
     <w:p>
@@ -425,13 +606,20 @@
     </w:p>
     <w:p>
       <w:r>
-        <w:t>The physical economy follows, slower at first, then faster. Early robotics is specialized: systems designed for narrow tasks. But the direction of travel is toward generality</w:t>
+        <w:t>Automation of the</w:t>
+      </w:r>
+      <w:r>
+        <w:t xml:space="preserve"> physical economy follows, slower at first, then faster. Early robotics is specialized: systems designed for narrow tasks. But the direction of travel is toward generality</w:t>
       </w:r>
       <w:r>
         <w:t xml:space="preserve">, toward </w:t>
       </w:r>
       <w:r>
-        <w:t>machines that can be retrained and redeployed, because the bottleneck is no longer the actuator but the cognition that coordinates perception, planning, and control. Automation creeps into warehousing, manufacturing, mining, agriculture, construction, maintenance, logistic</w:t>
+        <w:t xml:space="preserve">machines that can be retrained and redeployed, because the bottleneck is no longer the actuator but the </w:t>
+      </w:r>
+      <w:r>
+        <w:lastRenderedPageBreak/>
+        <w:t>cognition that coordinates perception, planning, and control. Automation creeps into warehousing, manufacturing, mining, agriculture, construction, maintenance, logistic</w:t>
       </w:r>
       <w:r>
         <w:t xml:space="preserve">, and </w:t>
@@ -447,7 +635,6 @@
           <w:b/>
           <w:bCs/>
         </w:rPr>
-        <w:lastRenderedPageBreak/>
         <w:t>By the “second wave,”</w:t>
       </w:r>
       <w:r>
@@ -557,12 +744,12 @@
     </w:p>
     <w:p>
       <w:r>
+        <w:lastRenderedPageBreak/>
         <w:t>This is where the model begins: not at the start of automation, but at the point where the feedback loop between output and purchasing power starts to break.</w:t>
       </w:r>
     </w:p>
     <w:p>
       <w:r>
-        <w:lastRenderedPageBreak/>
         <w:t xml:space="preserve">The design problem is now explicit. If wages are no longer the dominant channel by which households receive income, what </w:t>
       </w:r>
       <w:r>
@@ -701,12 +888,19 @@
           <w:i/>
           <w:iCs/>
         </w:rPr>
-        <w:t>a cost of doing business in a high-automation economy, like a tax, like regulatory compliance, like stock-based compensation. The market can price it. What markets can’t price is unpredictable backlash.”</w:t>
-      </w:r>
-    </w:p>
-    <w:p>
-      <w:r>
+        <w:t xml:space="preserve">a cost of doing business in a high-automation economy, like a tax, </w:t>
+      </w:r>
+      <w:r>
+        <w:rPr>
+          <w:i/>
+          <w:iCs/>
+        </w:rPr>
         <w:lastRenderedPageBreak/>
+        <w:t>like regulatory compliance, like stock-based compensation. The market can price it. What markets can’t price is unpredictable backlash.”</w:t>
+      </w:r>
+    </w:p>
+    <w:p>
+      <w:r>
         <w:t xml:space="preserve">That predictability is central. A small, stable, widely applied dilution rate is something investors can incorporate into valuation. It reduces the risk premium associated with tail events: windfall confiscation, arbitrary sector-specific punishments, or emergency interventions that arrive precisely when credit is already tight. A rule-based mechanism is not “free,” but </w:t>
       </w:r>
       <w:r>
@@ -762,7 +956,13 @@
         <w:t xml:space="preserve">, </w:t>
       </w:r>
       <w:r>
-        <w:t>modeled as a VAT wedge between producer and consumer prices—paired with a targeted low-income credit (“</w:t>
+        <w:t>modeled as a VAT wedge between producer and consumer prices</w:t>
+      </w:r>
+      <w:r>
+        <w:t xml:space="preserve">, </w:t>
+      </w:r>
+      <w:r>
+        <w:t>paired with a targeted low-income credit (“</w:t>
       </w:r>
       <w:proofErr w:type="spellStart"/>
       <w:r>
@@ -770,12 +970,18 @@
       </w:r>
       <w:proofErr w:type="spellEnd"/>
       <w:r>
-        <w:t>”) so the tax does not function as a regressive demand-killer. A VAT is attractive in this world because it scales with consumption in an economy where wages are no longer the primary taxable flow, and because it can be enforced more reliably than an ever-more-complex wage-tax system.</w:t>
-      </w:r>
-    </w:p>
-    <w:p>
+        <w:t xml:space="preserve">”) so the tax does not function as a regressive demand-killer. A VAT is attractive in this world because it scales with consumption in an </w:t>
+      </w:r>
       <w:r>
         <w:lastRenderedPageBreak/>
+        <w:t>economy where wages are no longer the primary taxable flow, and because it can be enforced more reliably than an ever-more-complex wage-tax system.</w:t>
+      </w:r>
+      <w:r>
+        <w:t xml:space="preserve"> The model does however include an income tax (flat rate on wages above a minimum income), and an indexed corporate tax that rises somewhat as wages fall.</w:t>
+      </w:r>
+    </w:p>
+    <w:p>
+      <w:r>
         <w:t>The third pillar is Universal Basic Income, defined in a way that matches the systems-engineering problem. In the model, UBI is computed to fill the gap between market incomes and a baseline real-income pool. It is indexed to the price level</w:t>
       </w:r>
       <w:r>
@@ -986,7 +1192,15 @@
           <w:rFonts w:eastAsia="Times New Roman" w:cs="Times New Roman"/>
           <w:color w:val="000000"/>
         </w:rPr>
-        <w:t> burden of that fixed nominal payment skyrockets. If a household's nominal income is cut in half by automation, a fixed $2,000 monthly mortgage effectively becomes a $4,000 monthly burden.</w:t>
+        <w:t xml:space="preserve"> burden of that fixed nominal payment skyrockets. If a household's nominal income is </w:t>
+      </w:r>
+      <w:r>
+        <w:rPr>
+          <w:rFonts w:eastAsia="Times New Roman" w:cs="Times New Roman"/>
+          <w:color w:val="000000"/>
+        </w:rPr>
+        <w:lastRenderedPageBreak/>
+        <w:t>cut in half by automation, a fixed $2,000 monthly mortgage effectively becomes a $4,000 monthly burden.</w:t>
       </w:r>
     </w:p>
     <w:p>
@@ -1018,7 +1232,6 @@
           <w:rFonts w:eastAsia="Times New Roman" w:cs="Times New Roman"/>
           <w:color w:val="000000"/>
         </w:rPr>
-        <w:lastRenderedPageBreak/>
         <w:t>T</w:t>
       </w:r>
       <w:r>
@@ -1265,6 +1478,26 @@
     </w:p>
     <w:p>
       <w:pPr>
+        <w:rPr>
+          <w:rFonts w:ascii="Times New Roman" w:eastAsia="Times New Roman" w:hAnsi="Times New Roman"/>
+        </w:rPr>
+      </w:pPr>
+      <w:r>
+        <w:rPr>
+          <w:rFonts w:eastAsia="Times New Roman" w:cs="Times New Roman"/>
+          <w:color w:val="000000"/>
+        </w:rPr>
+        <w:t>The political economy of a "bank bailout" is usually toxic, as it implies taxing human labor to save institutional capital. However, in the hyper-abundant automation scenario, this dynamic is inverted.</w:t>
+      </w:r>
+      <w:r>
+        <w:t xml:space="preserve"> </w:t>
+      </w:r>
+      <w:r>
+        <w:t>In the 2008 financial crisis, bank bailouts triggered generational political outrage because they were funded by public debt while households were left to default.</w:t>
+      </w:r>
+    </w:p>
+    <w:p>
+      <w:pPr>
         <w:spacing w:before="100" w:beforeAutospacing="1" w:after="100" w:afterAutospacing="1" w:line="240" w:lineRule="auto"/>
         <w:rPr>
           <w:rFonts w:eastAsia="Times New Roman" w:cs="Times New Roman"/>
@@ -1276,7 +1509,8 @@
           <w:rFonts w:eastAsia="Times New Roman" w:cs="Times New Roman"/>
           <w:color w:val="000000"/>
         </w:rPr>
-        <w:t>The political economy of a "bank bailout" is usually toxic, as it implies taxing human labor to save institutional capital. However, in the hyper-abundant automation scenario, this dynamic is inverted.</w:t>
+        <w:lastRenderedPageBreak/>
+        <w:t>Because the Social Wealth Trust and the Universal Basic Income keep the consumer base solvent, aggregate demand remains high. Because demand is high, the highly automated corporate sector generates immense retained earnings. The dynamic Corporate Tax and the VAT capture a portion of this massive, machine-generated surplus.</w:t>
       </w:r>
     </w:p>
     <w:p>
@@ -1292,41 +1526,7 @@
           <w:rFonts w:eastAsia="Times New Roman" w:cs="Times New Roman"/>
           <w:color w:val="000000"/>
         </w:rPr>
-        <w:t>Because the Social Wealth Trust and the Universal Basic Income keep the consumer base solvent, aggregate demand remains high. Because demand is high, the highly automated corporate sector generates immense retained earnings. The dynamic Corporate Tax and the VAT capture a portion of this massive, machine-generated surplus.</w:t>
-      </w:r>
-    </w:p>
-    <w:p>
-      <w:pPr>
-        <w:spacing w:before="100" w:beforeAutospacing="1" w:after="100" w:afterAutospacing="1" w:line="240" w:lineRule="auto"/>
-        <w:rPr>
-          <w:rFonts w:eastAsia="Times New Roman" w:cs="Times New Roman"/>
-          <w:color w:val="000000"/>
-        </w:rPr>
-      </w:pPr>
-      <w:r>
-        <w:rPr>
-          <w:rFonts w:eastAsia="Times New Roman" w:cs="Times New Roman"/>
-          <w:color w:val="000000"/>
-        </w:rPr>
-        <w:t xml:space="preserve">Simulation runs demonstrate that these endogenous tax receipts are sufficient to fully cover the transfer without triggering inflationary monetary issuance. The immense productivity gains of artificial </w:t>
-      </w:r>
-      <w:r>
-        <w:rPr>
-          <w:rFonts w:eastAsia="Times New Roman" w:cs="Times New Roman"/>
-          <w:color w:val="000000"/>
-        </w:rPr>
-        <w:lastRenderedPageBreak/>
-        <w:t>intelligence are successfully taxed to peacefully dismantle the legacy debt of the human workforce. The bondholders receive their expected yield, the households keep their homes, and the transition to a high-wealth, low-wage economy crosses the "valley of death" with its financial infrastructure fully intact.</w:t>
-      </w:r>
-    </w:p>
-    <w:p>
-      <w:pPr>
-        <w:rPr>
-          <w:rFonts w:ascii="Times New Roman" w:eastAsia="Times New Roman" w:hAnsi="Times New Roman"/>
-        </w:rPr>
-      </w:pPr>
-      <w:r>
-        <w:t>In the 2008 financial crisis, bank bailouts triggered generational political outrage because they were funded by public debt while households were left to default.</w:t>
+        <w:t>Simulation runs demonstrate that these endogenous tax receipts are sufficient to fully cover the transfer without triggering inflationary monetary issuance. The immense productivity gains of artificial intelligence are successfully taxed to peacefully dismantle the legacy debt of the human workforce. The bondholders receive their expected yield, the households keep their homes, and the transition to a high-wealth, low-wage economy crosses the "valley of death" with its financial infrastructure fully intact.</w:t>
       </w:r>
     </w:p>
     <w:p>

</xml_diff>